<commit_message>
docs(minister): item (iii) — address the proposal to four addressees, add the ZEPARI partnership + endorsement ask and the four-bucket funding route; sync the superseded coverage figures
</commit_message>
<xml_diff>
--- a/Minister Submission/Oreida_Proposal_Minister_of_ICT.docx
+++ b/Minister Submission/Oreida_Proposal_Minister_of_ICT.docx
@@ -11,13 +11,13 @@
         <w:t xml:space="preserve">PROPOSAL FOR A PILOT POLICY-SIMULATION CAPABILITY</w:t>
       </w:r>
     </w:p>
-    <w:bookmarkStart w:id="9" w:name="X87f47e32495654ac30320d96c61af7be8b3c34f"/>
+    <w:bookmarkStart w:id="9" w:name="Xcca17ad94b06e8db3523e1bc76e10cec5c10370"/>
     <w:p>
       <w:pPr>
         <w:pStyle w:val="Heading2"/>
       </w:pPr>
       <w:r>
-        <w:t xml:space="preserve">Retained by the Ministry of Information Communication Technology, Postal and Courier Services</w:t>
+        <w:t xml:space="preserve">Retained by the Ministry of Information Communication Technology, Postal and Courier Services, in partnership with ZEPARI</w:t>
       </w:r>
     </w:p>
     <w:p>
@@ -31,182 +31,53 @@
         </w:rPr>
         <w:t xml:space="preserve">Submitted to:</w:t>
       </w:r>
-      <w:r>
-        <w:t xml:space="preserve"> </w:t>
-      </w:r>
-      <w:r>
-        <w:t xml:space="preserve">Hon. Tatenda Mavetera, MP — Minister of Information Communication Technology, Postal and Courier Services</w:t>
-      </w:r>
-    </w:p>
-    <w:p>
-      <w:pPr>
-        <w:pStyle w:val="BodyText"/>
-      </w:pPr>
-      <w:r>
-        <w:rPr>
-          <w:b/>
-          <w:bCs/>
-        </w:rPr>
-        <w:t xml:space="preserve">Submitted by:</w:t>
-      </w:r>
-      <w:r>
-        <w:t xml:space="preserve"> </w:t>
-      </w:r>
-      <w:r>
-        <w:t xml:space="preserve">Oreida Pvt Ltd, represented by Mr Edmore Zviitwah and Mr Tadii Tendayi</w:t>
-      </w:r>
-    </w:p>
-    <w:p>
-      <w:pPr>
-        <w:pStyle w:val="BodyText"/>
-      </w:pPr>
-      <w:r>
-        <w:rPr>
-          <w:b/>
-          <w:bCs/>
-        </w:rPr>
-        <w:t xml:space="preserve">Date:</w:t>
-      </w:r>
-      <w:r>
-        <w:t xml:space="preserve"> </w:t>
-      </w:r>
-      <w:r>
-        <w:t xml:space="preserve">2 October 2026</w:t>
-      </w:r>
-    </w:p>
-    <w:p>
-      <w:pPr>
-        <w:pStyle w:val="BodyText"/>
-      </w:pPr>
-      <w:r>
-        <w:rPr>
-          <w:b/>
-          <w:bCs/>
-        </w:rPr>
-        <w:t xml:space="preserve">Status:</w:t>
-      </w:r>
-      <w:r>
-        <w:t xml:space="preserve"> </w:t>
-      </w:r>
-      <w:r>
-        <w:t xml:space="preserve">For Decision</w:t>
-      </w:r>
-    </w:p>
-    <w:p>
-      <w:r>
-        <w:pict>
-          <v:rect style="width:0;height:1.5pt" o:hralign="center" o:hrstd="t" o:hr="t"/>
-        </w:pict>
-      </w:r>
-    </w:p>
-    <w:bookmarkEnd w:id="9"/>
-    <w:bookmarkStart w:id="10" w:name="X6005bef71425db1c89b1b6ad897616225c5ce83"/>
-    <w:p>
-      <w:pPr>
-        <w:pStyle w:val="Heading2"/>
-      </w:pPr>
-      <w:r>
-        <w:t xml:space="preserve">Part A — Covering letter to the Honourable Minister</w:t>
-      </w:r>
-    </w:p>
-    <w:p>
-      <w:pPr>
-        <w:pStyle w:val="FirstParagraph"/>
-      </w:pPr>
-      <w:r>
-        <w:t xml:space="preserve">Dear Honourable Minister,</w:t>
-      </w:r>
-    </w:p>
-    <w:p>
-      <w:pPr>
+    </w:p>
+    <w:p>
+      <w:pPr>
+        <w:pStyle w:val="Compact"/>
         <w:numPr>
           <w:ilvl w:val="0"/>
           <w:numId w:val="1001"/>
         </w:numPr>
       </w:pPr>
       <w:r>
-        <w:t xml:space="preserve">Oreida Pvt Ltd respectfully submits this proposal for a pilot policy-simulation capability to be retained by the Ministry of Information Communication Technology, Postal and Courier Services, and put to work as a pilot for the</w:t>
-      </w:r>
-      <w:r>
-        <w:t xml:space="preserve"> </w:t>
-      </w:r>
-      <w:r>
-        <w:rPr>
-          <w:b/>
-          <w:bCs/>
-        </w:rPr>
-        <w:t xml:space="preserve">Digitalize Zimbabwe</w:t>
-      </w:r>
-      <w:r>
-        <w:t xml:space="preserve"> </w:t>
-      </w:r>
-      <w:r>
-        <w:t xml:space="preserve">initiative.</w:t>
-      </w:r>
-    </w:p>
-    <w:p>
-      <w:pPr>
+        <w:t xml:space="preserve">Hon. Tatenda Mavetera, MP — Minister of Information Communication Technology, Postal and Courier Services</w:t>
+      </w:r>
+    </w:p>
+    <w:p>
+      <w:pPr>
+        <w:pStyle w:val="Compact"/>
         <w:numPr>
           <w:ilvl w:val="0"/>
           <w:numId w:val="1001"/>
         </w:numPr>
       </w:pPr>
       <w:r>
-        <w:t xml:space="preserve">The capability already exists and works. It is a browser-based platform, built and deployed, that lets a government department test a draft policy against a simulated population before the policy is implemented, and that produces structured findings for human review. It is not a concept, a mock-up or a promise: it runs today in an ordinary web browser and makes no network request at all.</w:t>
-      </w:r>
-    </w:p>
-    <w:p>
-      <w:pPr>
+        <w:t xml:space="preserve">Dr. Gibson Chigumira — Executive Director, ZEPARI (the Zimbabwe Economic Policy Analysis and Research Institute)</w:t>
+      </w:r>
+    </w:p>
+    <w:p>
+      <w:pPr>
+        <w:pStyle w:val="Compact"/>
         <w:numPr>
           <w:ilvl w:val="0"/>
           <w:numId w:val="1001"/>
         </w:numPr>
       </w:pPr>
       <w:r>
-        <w:t xml:space="preserve">What we are asking for is small and specific. We ask the Ministry to (a) endorse the platform as a pilot for the</w:t>
-      </w:r>
-      <w:r>
-        <w:t xml:space="preserve"> </w:t>
-      </w:r>
-      <w:r>
-        <w:rPr>
-          <w:b/>
-          <w:bCs/>
-        </w:rPr>
-        <w:t xml:space="preserve">Digitalize Zimbabwe</w:t>
-      </w:r>
-      <w:r>
-        <w:t xml:space="preserve"> </w:t>
-      </w:r>
-      <w:r>
-        <w:t xml:space="preserve">initiative, (b) fund the three named build steps that harden the demonstration for Government use, and (c) host the pilot inside the Ministry. The detail is set out in Part B, and the decision requested is repeated in a single page at Part C.</w:t>
-      </w:r>
-    </w:p>
-    <w:p>
-      <w:pPr>
+        <w:t xml:space="preserve">Dr. Jesimen Chipika — Deputy Governor, Reserve Bank of Zimbabwe; Chairperson, ZEPARI Board of Trustees</w:t>
+      </w:r>
+    </w:p>
+    <w:p>
+      <w:pPr>
+        <w:pStyle w:val="Compact"/>
         <w:numPr>
           <w:ilvl w:val="0"/>
           <w:numId w:val="1001"/>
         </w:numPr>
       </w:pPr>
       <w:r>
-        <w:t xml:space="preserve">We hold</w:t>
-      </w:r>
-      <w:r>
-        <w:t xml:space="preserve"> </w:t>
-      </w:r>
-      <w:r>
-        <w:rPr>
-          <w:b/>
-          <w:bCs/>
-        </w:rPr>
-        <w:t xml:space="preserve">no</w:t>
-      </w:r>
-      <w:r>
-        <w:t xml:space="preserve"> </w:t>
-      </w:r>
-      <w:r>
-        <w:t xml:space="preserve">endorsement from the Ministry or from any national programme for this platform. Obtaining that endorsement is precisely part of what is being requested.</w:t>
+        <w:t xml:space="preserve">The ZEPARI Board of Trustees, including the seats held by the Chamber of Mines of Zimbabwe and the Confederation of Zimbabwe Industries (CZI)</w:t>
       </w:r>
     </w:p>
     <w:p>
@@ -214,7 +85,17 @@
         <w:pStyle w:val="FirstParagraph"/>
       </w:pPr>
       <w:r>
-        <w:t xml:space="preserve">We remain at the Honourable Minister’s disposal for a live demonstration at any time.</w:t>
+        <w:rPr>
+          <w:b/>
+          <w:bCs/>
+        </w:rPr>
+        <w:t xml:space="preserve">Submitted by:</w:t>
+      </w:r>
+      <w:r>
+        <w:t xml:space="preserve"> </w:t>
+      </w:r>
+      <w:r>
+        <w:t xml:space="preserve">Oreida Pvt Ltd, represented by Mr Edmore Zviitwah and Mr Tadii Tendayi</w:t>
       </w:r>
     </w:p>
     <w:p>
@@ -222,7 +103,17 @@
         <w:pStyle w:val="BodyText"/>
       </w:pPr>
       <w:r>
-        <w:t xml:space="preserve">Yours faithfully,</w:t>
+        <w:rPr>
+          <w:b/>
+          <w:bCs/>
+        </w:rPr>
+        <w:t xml:space="preserve">Date:</w:t>
+      </w:r>
+      <w:r>
+        <w:t xml:space="preserve"> </w:t>
+      </w:r>
+      <w:r>
+        <w:t xml:space="preserve">2 October 2026</w:t>
       </w:r>
     </w:p>
     <w:p>
@@ -234,23 +125,13 @@
           <w:b/>
           <w:bCs/>
         </w:rPr>
-        <w:t xml:space="preserve">Oreida Pvt Ltd</w:t>
-      </w:r>
-    </w:p>
-    <w:p>
-      <w:pPr>
-        <w:pStyle w:val="BodyText"/>
-      </w:pPr>
-      <w:r>
-        <w:t xml:space="preserve">Mr Edmore Zviitwah — Representative</w:t>
-      </w:r>
-    </w:p>
-    <w:p>
-      <w:pPr>
-        <w:pStyle w:val="BodyText"/>
-      </w:pPr>
-      <w:r>
-        <w:t xml:space="preserve">Mr Tadii Tendayi — Representative</w:t>
+        <w:t xml:space="preserve">Status:</w:t>
+      </w:r>
+      <w:r>
+        <w:t xml:space="preserve"> </w:t>
+      </w:r>
+      <w:r>
+        <w:t xml:space="preserve">For Decision</w:t>
       </w:r>
     </w:p>
     <w:p>
@@ -260,6 +141,183 @@
         </w:pict>
       </w:r>
     </w:p>
+    <w:bookmarkEnd w:id="9"/>
+    <w:bookmarkStart w:id="10" w:name="X6005bef71425db1c89b1b6ad897616225c5ce83"/>
+    <w:p>
+      <w:pPr>
+        <w:pStyle w:val="Heading2"/>
+      </w:pPr>
+      <w:r>
+        <w:t xml:space="preserve">Part A — Covering letter to the Honourable Minister</w:t>
+      </w:r>
+    </w:p>
+    <w:p>
+      <w:pPr>
+        <w:pStyle w:val="FirstParagraph"/>
+      </w:pPr>
+      <w:r>
+        <w:t xml:space="preserve">Dear Honourable Minister, Members of the ZEPARI Board and Executive,</w:t>
+      </w:r>
+    </w:p>
+    <w:p>
+      <w:pPr>
+        <w:numPr>
+          <w:ilvl w:val="0"/>
+          <w:numId w:val="1002"/>
+        </w:numPr>
+      </w:pPr>
+      <w:r>
+        <w:t xml:space="preserve">Oreida Pvt Ltd respectfully submits this proposal for a pilot policy-simulation capability to be retained by the Ministry of Information Communication Technology, Postal and Courier Services, in partnership with ZEPARI, and put to work as a pilot for the</w:t>
+      </w:r>
+      <w:r>
+        <w:t xml:space="preserve"> </w:t>
+      </w:r>
+      <w:r>
+        <w:rPr>
+          <w:b/>
+          <w:bCs/>
+        </w:rPr>
+        <w:t xml:space="preserve">Digitalize Zimbabwe</w:t>
+      </w:r>
+      <w:r>
+        <w:t xml:space="preserve"> </w:t>
+      </w:r>
+      <w:r>
+        <w:t xml:space="preserve">initiative.</w:t>
+      </w:r>
+    </w:p>
+    <w:p>
+      <w:pPr>
+        <w:numPr>
+          <w:ilvl w:val="0"/>
+          <w:numId w:val="1002"/>
+        </w:numPr>
+      </w:pPr>
+      <w:r>
+        <w:t xml:space="preserve">The capability already exists and works. It is a browser-based platform, built and deployed, that lets a government department test a draft policy against a simulated population before the policy is implemented, and that produces structured findings for human review. It is not a concept, a mock-up or a promise: it runs today in an ordinary web browser and makes no network request at all.</w:t>
+      </w:r>
+    </w:p>
+    <w:p>
+      <w:pPr>
+        <w:numPr>
+          <w:ilvl w:val="0"/>
+          <w:numId w:val="1002"/>
+        </w:numPr>
+      </w:pPr>
+      <w:r>
+        <w:t xml:space="preserve">What we are asking for is small and specific. We ask the Ministry to (a) endorse the platform as a pilot for the</w:t>
+      </w:r>
+      <w:r>
+        <w:t xml:space="preserve"> </w:t>
+      </w:r>
+      <w:r>
+        <w:rPr>
+          <w:b/>
+          <w:bCs/>
+        </w:rPr>
+        <w:t xml:space="preserve">Digitalize Zimbabwe</w:t>
+      </w:r>
+      <w:r>
+        <w:t xml:space="preserve"> </w:t>
+      </w:r>
+      <w:r>
+        <w:t xml:space="preserve">initiative, (b) fund the three named build steps that harden the demonstration for Government use, and (c) host the pilot inside the Ministry. We ask</w:t>
+      </w:r>
+      <w:r>
+        <w:t xml:space="preserve"> </w:t>
+      </w:r>
+      <w:r>
+        <w:rPr>
+          <w:b/>
+          <w:bCs/>
+        </w:rPr>
+        <w:t xml:space="preserve">ZEPARI</w:t>
+      </w:r>
+      <w:r>
+        <w:t xml:space="preserve"> </w:t>
+      </w:r>
+      <w:r>
+        <w:t xml:space="preserve">to (d) partner on the evidence base and the methods, and (e) endorse the platform as a pilot for ZEPARI’s evidence-based policy work. Oreida Pvt Ltd seeks to partner with ZEPARI and the Ministry of ICT, and the two endorsements are sought together. The detail is set out in Part B, and the decision requested is repeated in a single page at Part C.</w:t>
+      </w:r>
+    </w:p>
+    <w:p>
+      <w:pPr>
+        <w:numPr>
+          <w:ilvl w:val="0"/>
+          <w:numId w:val="1002"/>
+        </w:numPr>
+      </w:pPr>
+      <w:r>
+        <w:t xml:space="preserve">We hold</w:t>
+      </w:r>
+      <w:r>
+        <w:t xml:space="preserve"> </w:t>
+      </w:r>
+      <w:r>
+        <w:rPr>
+          <w:b/>
+          <w:bCs/>
+        </w:rPr>
+        <w:t xml:space="preserve">no</w:t>
+      </w:r>
+      <w:r>
+        <w:t xml:space="preserve"> </w:t>
+      </w:r>
+      <w:r>
+        <w:t xml:space="preserve">endorsement from the Ministry, from ZEPARI or from any national programme for this platform. Obtaining those endorsements is precisely part of what is being requested.</w:t>
+      </w:r>
+    </w:p>
+    <w:p>
+      <w:pPr>
+        <w:pStyle w:val="FirstParagraph"/>
+      </w:pPr>
+      <w:r>
+        <w:t xml:space="preserve">We remain at the Honourable Minister’s disposal for a live demonstration at any time.</w:t>
+      </w:r>
+    </w:p>
+    <w:p>
+      <w:pPr>
+        <w:pStyle w:val="BodyText"/>
+      </w:pPr>
+      <w:r>
+        <w:t xml:space="preserve">Yours faithfully,</w:t>
+      </w:r>
+    </w:p>
+    <w:p>
+      <w:pPr>
+        <w:pStyle w:val="BodyText"/>
+      </w:pPr>
+      <w:r>
+        <w:rPr>
+          <w:b/>
+          <w:bCs/>
+        </w:rPr>
+        <w:t xml:space="preserve">Oreida Pvt Ltd</w:t>
+      </w:r>
+    </w:p>
+    <w:p>
+      <w:pPr>
+        <w:pStyle w:val="BodyText"/>
+      </w:pPr>
+      <w:r>
+        <w:t xml:space="preserve">Mr Edmore Zviitwah — Representative</w:t>
+      </w:r>
+    </w:p>
+    <w:p>
+      <w:pPr>
+        <w:pStyle w:val="BodyText"/>
+      </w:pPr>
+      <w:r>
+        <w:t xml:space="preserve">Mr Tadii Tendayi — Representative</w:t>
+      </w:r>
+    </w:p>
+    <w:p>
+      <w:r>
+        <w:pict>
+          <v:rect style="width:0;height:1.5pt" o:hralign="center" o:hrstd="t" o:hr="t"/>
+        </w:pict>
+      </w:r>
+    </w:p>
     <w:bookmarkEnd w:id="10"/>
     <w:bookmarkStart w:id="25" w:name="part-b-memorandum-for-decision"/>
     <w:p>
@@ -316,7 +374,20 @@
         <w:t xml:space="preserve"> </w:t>
       </w:r>
       <w:r>
-        <w:t xml:space="preserve">initiative, hosted inside the Ministry, and funded for the three named build steps below.</w:t>
+        <w:t xml:space="preserve">initiative, hosted inside the Ministry, and funded for the three named build steps below,</w:t>
+      </w:r>
+      <w:r>
+        <w:t xml:space="preserve"> </w:t>
+      </w:r>
+      <w:r>
+        <w:rPr>
+          <w:b/>
+          <w:bCs/>
+        </w:rPr>
+        <w:t xml:space="preserve">in partnership with ZEPARI</w:t>
+      </w:r>
+      <w:r>
+        <w:t xml:space="preserve">, whose endorsement of the platform as a pilot for ZEPARI’s evidence-based policy work is sought at the same time.</w:t>
       </w:r>
     </w:p>
     <w:p>
@@ -395,7 +466,23 @@
         <w:t xml:space="preserve"> </w:t>
       </w:r>
       <w:r>
-        <w:t xml:space="preserve">platform.</w:t>
+        <w:t xml:space="preserve">platform. It is offered jointly: Oreida Pvt Ltd seeks to partner with</w:t>
+      </w:r>
+      <w:r>
+        <w:t xml:space="preserve"> </w:t>
+      </w:r>
+      <w:r>
+        <w:rPr>
+          <w:b/>
+          <w:bCs/>
+        </w:rPr>
+        <w:t xml:space="preserve">ZEPARI</w:t>
+      </w:r>
+      <w:r>
+        <w:t xml:space="preserve"> </w:t>
+      </w:r>
+      <w:r>
+        <w:t xml:space="preserve">and with the Ministry of Information Communication Technology, Postal and Courier Services — the Ministry to host the pilot inside Government, and ZEPARI to partner on the evidence base and the methods.</w:t>
       </w:r>
     </w:p>
     <w:p>
@@ -550,7 +637,7 @@
           <w:b/>
           <w:bCs/>
         </w:rPr>
-        <w:t xml:space="preserve">72 modelled stakeholder groups</w:t>
+        <w:t xml:space="preserve">150 modelled stakeholder groups</w:t>
       </w:r>
       <w:r>
         <w:t xml:space="preserve">, including civil servants, urban and rural households, informal traders, manufacturers, mining operators, smallholder farmers, the diaspora, youth, women, pensioners, the financial sector, exporters, local authorities, development partners, health workers, educators, traditional leaders, faith-based organisations, trade unions, employer federations, cooperatives, the media, tourism and transport operators, energy and water utilities, and persons with disabilities.</w:t>
@@ -563,7 +650,7 @@
           <w:b/>
           <w:bCs/>
         </w:rPr>
-        <w:t xml:space="preserve">20 of the 72 stand on a published national share</w:t>
+        <w:t xml:space="preserve">20 of the 150 stand on a published national share</w:t>
       </w:r>
       <w:r>
         <w:t xml:space="preserve">, each naming the figure it stands for and the publication it came from; the remaining</w:t>
@@ -576,7 +663,7 @@
           <w:b/>
           <w:bCs/>
         </w:rPr>
-        <w:t xml:space="preserve">52 are explicitly labelled</w:t>
+        <w:t xml:space="preserve">130 are explicitly labelled</w:t>
       </w:r>
       <w:r>
         <w:rPr>
@@ -604,13 +691,13 @@
           <w:b/>
           <w:bCs/>
         </w:rPr>
-        <w:t xml:space="preserve">24 groups</w:t>
-      </w:r>
-      <w:r>
-        <w:t xml:space="preserve"> </w:t>
-      </w:r>
-      <w:r>
-        <w:t xml:space="preserve">its own mandate covers, drawn from these 72.</w:t>
+        <w:t xml:space="preserve">40 groups</w:t>
+      </w:r>
+      <w:r>
+        <w:t xml:space="preserve"> </w:t>
+      </w:r>
+      <w:r>
+        <w:t xml:space="preserve">its own mandate covers, drawn from these 150.</w:t>
       </w:r>
     </w:p>
     <w:p>
@@ -628,7 +715,7 @@
           <w:b/>
           <w:bCs/>
         </w:rPr>
-        <w:t xml:space="preserve">160 reference indicators</w:t>
+        <w:t xml:space="preserve">510 reference indicators</w:t>
       </w:r>
       <w:r>
         <w:t xml:space="preserve"> </w:t>
@@ -644,7 +731,7 @@
           <w:b/>
           <w:bCs/>
         </w:rPr>
-        <w:t xml:space="preserve">24 are published figures</w:t>
+        <w:t xml:space="preserve">275 are published figures</w:t>
       </w:r>
       <w:r>
         <w:t xml:space="preserve">, each naming its publisher, its publication and its period, and</w:t>
@@ -657,7 +744,7 @@
           <w:b/>
           <w:bCs/>
         </w:rPr>
-        <w:t xml:space="preserve">136 are explicitly labelled</w:t>
+        <w:t xml:space="preserve">235 are explicitly labelled</w:t>
       </w:r>
       <w:r>
         <w:rPr>
@@ -884,13 +971,13 @@
       </w:r>
     </w:p>
     <w:bookmarkEnd w:id="14"/>
-    <w:bookmarkStart w:id="15" w:name="the-pilot-case-digitalize-zimbabwe"/>
+    <w:bookmarkStart w:id="15" w:name="Xf4e694884b38fb095f87b2db45800fe9c5b4e5a"/>
     <w:p>
       <w:pPr>
         <w:pStyle w:val="Heading3"/>
       </w:pPr>
       <w:r>
-        <w:t xml:space="preserve">5. The pilot case — Digitalize Zimbabwe</w:t>
+        <w:t xml:space="preserve">5. The pilot case — Digitalize Zimbabwe, with ZEPARI as research partner</w:t>
       </w:r>
     </w:p>
     <w:p>
@@ -1208,6 +1295,69 @@
       </w:r>
       <w:r>
         <w:t xml:space="preserve">endorsement of this platform, and obtaining one is part of the ask.</w:t>
+      </w:r>
+    </w:p>
+    <w:p>
+      <w:pPr>
+        <w:pStyle w:val="BodyText"/>
+      </w:pPr>
+      <w:r>
+        <w:t xml:space="preserve">5.8</w:t>
+      </w:r>
+      <w:r>
+        <w:t xml:space="preserve"> </w:t>
+      </w:r>
+      <w:r>
+        <w:rPr>
+          <w:b/>
+          <w:bCs/>
+        </w:rPr>
+        <w:t xml:space="preserve">ZEPARI — the research partner.</w:t>
+      </w:r>
+      <w:r>
+        <w:t xml:space="preserve"> </w:t>
+      </w:r>
+      <w:r>
+        <w:rPr>
+          <w:b/>
+          <w:bCs/>
+        </w:rPr>
+        <w:t xml:space="preserve">ZEPARI</w:t>
+      </w:r>
+      <w:r>
+        <w:t xml:space="preserve"> </w:t>
+      </w:r>
+      <w:r>
+        <w:t xml:space="preserve">is the</w:t>
+      </w:r>
+      <w:r>
+        <w:t xml:space="preserve"> </w:t>
+      </w:r>
+      <w:r>
+        <w:rPr>
+          <w:b/>
+          <w:bCs/>
+        </w:rPr>
+        <w:t xml:space="preserve">Zimbabwe Economic Policy Analysis and Research Institute</w:t>
+      </w:r>
+      <w:r>
+        <w:t xml:space="preserve">, an autonomous economic policy analysis and research think-tank established in 2003 by a Deed of Trust. Its stated mission is to conduct applied economic policy analysis, research and capacity building to promote a culture of evidence-based policy making in Zimbabwe. That is precisely the evidence base this platform consumes, which is why Oreida Pvt Ltd seeks to partner with ZEPARI: the Ministry hosts the capability, and ZEPARI owns the evidence and the methods independently. ZEPARI is asked to partner, and to endorse the platform as a pilot for its evidence-based policy work. ZEPARI holds</w:t>
+      </w:r>
+      <w:r>
+        <w:t xml:space="preserve"> </w:t>
+      </w:r>
+      <w:r>
+        <w:rPr>
+          <w:b/>
+          <w:bCs/>
+        </w:rPr>
+        <w:t xml:space="preserve">no</w:t>
+      </w:r>
+      <w:r>
+        <w:t xml:space="preserve"> </w:t>
+      </w:r>
+      <w:r>
+        <w:t xml:space="preserve">endorsement of this platform today, and obtaining one is part of the ask.</w:t>
       </w:r>
     </w:p>
     <w:bookmarkEnd w:id="15"/>
@@ -1322,7 +1472,7 @@
         <w:pStyle w:val="FirstParagraph"/>
       </w:pPr>
       <w:r>
-        <w:t xml:space="preserve">8.1 The table below separates one-off costs from recurring costs. Every figure is an</w:t>
+        <w:t xml:space="preserve">8.1 The tables below separate one-off costs from recurring costs. Every figure is an</w:t>
       </w:r>
       <w:r>
         <w:t xml:space="preserve"> </w:t>
@@ -1338,6 +1488,388 @@
       </w:r>
       <w:r>
         <w:t xml:space="preserve">and none is presented as approved. A full Treasury business case is not part of this proposal and would be produced after an approval in principle, if required.</w:t>
+      </w:r>
+    </w:p>
+    <w:p>
+      <w:pPr>
+        <w:pStyle w:val="BodyText"/>
+      </w:pPr>
+      <w:r>
+        <w:t xml:space="preserve">8.2</w:t>
+      </w:r>
+      <w:r>
+        <w:t xml:space="preserve"> </w:t>
+      </w:r>
+      <w:r>
+        <w:rPr>
+          <w:b/>
+          <w:bCs/>
+        </w:rPr>
+        <w:t xml:space="preserve">The proposed funding route.</w:t>
+      </w:r>
+      <w:r>
+        <w:t xml:space="preserve"> </w:t>
+      </w:r>
+      <w:r>
+        <w:t xml:space="preserve">No single budget should carry the whole cost, so the proposal spreads it across four named, matched routes. Each is a</w:t>
+      </w:r>
+      <w:r>
+        <w:t xml:space="preserve"> </w:t>
+      </w:r>
+      <w:r>
+        <w:rPr>
+          <w:b/>
+          <w:bCs/>
+        </w:rPr>
+        <w:t xml:space="preserve">proposed</w:t>
+      </w:r>
+      <w:r>
+        <w:t xml:space="preserve"> </w:t>
+      </w:r>
+      <w:r>
+        <w:t xml:space="preserve">route — the route is what is being recommended, not an agreement already in place — and each remains a</w:t>
+      </w:r>
+      <w:r>
+        <w:t xml:space="preserve"> </w:t>
+      </w:r>
+      <w:r>
+        <w:rPr>
+          <w:rStyle w:val="VerbatimChar"/>
+        </w:rPr>
+        <w:t xml:space="preserve">[QUESTION — needs a decision]</w:t>
+      </w:r>
+      <w:r>
+        <w:t xml:space="preserve"> </w:t>
+      </w:r>
+      <w:r>
+        <w:t xml:space="preserve">until the office named confirms it.</w:t>
+      </w:r>
+    </w:p>
+    <w:tbl>
+      <w:tblPr>
+        <w:tblStyle w:val="Table"/>
+        <w:tblW w:type="pct" w:w="5000"/>
+        <w:tblLayout w:type="fixed"/>
+        <w:tblLook w:firstRow="1" w:lastRow="0" w:firstColumn="0" w:lastColumn="0" w:noHBand="0" w:noVBand="0" w:val="0020"/>
+      </w:tblPr>
+      <w:tblGrid>
+        <w:gridCol w:w="2640"/>
+        <w:gridCol w:w="2640"/>
+        <w:gridCol w:w="2640"/>
+      </w:tblGrid>
+      <w:tr>
+        <w:trPr>
+          <w:tblHeader w:val="on"/>
+        </w:trPr>
+        <w:tc>
+          <w:tcPr/>
+          <w:p>
+            <w:pPr>
+              <w:pStyle w:val="Compact"/>
+            </w:pPr>
+            <w:r>
+              <w:t xml:space="preserve">#</w:t>
+            </w:r>
+          </w:p>
+        </w:tc>
+        <w:tc>
+          <w:tcPr/>
+          <w:p>
+            <w:pPr>
+              <w:pStyle w:val="Compact"/>
+            </w:pPr>
+            <w:r>
+              <w:t xml:space="preserve">What it pays for</w:t>
+            </w:r>
+          </w:p>
+        </w:tc>
+        <w:tc>
+          <w:tcPr/>
+          <w:p>
+            <w:pPr>
+              <w:pStyle w:val="Compact"/>
+            </w:pPr>
+            <w:r>
+              <w:t xml:space="preserve">Proposed route</w:t>
+            </w:r>
+          </w:p>
+        </w:tc>
+      </w:tr>
+      <w:tr>
+        <w:tc>
+          <w:tcPr/>
+          <w:p>
+            <w:pPr>
+              <w:pStyle w:val="Compact"/>
+            </w:pPr>
+            <w:r>
+              <w:t xml:space="preserve">8.3</w:t>
+            </w:r>
+          </w:p>
+        </w:tc>
+        <w:tc>
+          <w:tcPr/>
+          <w:p>
+            <w:pPr>
+              <w:pStyle w:val="Compact"/>
+            </w:pPr>
+            <w:r>
+              <w:t xml:space="preserve">The build — the three named build steps</w:t>
+            </w:r>
+          </w:p>
+        </w:tc>
+        <w:tc>
+          <w:tcPr/>
+          <w:p>
+            <w:pPr>
+              <w:pStyle w:val="Compact"/>
+            </w:pPr>
+            <w:r>
+              <w:t xml:space="preserve">The Ministry of ICT, through</w:t>
+            </w:r>
+            <w:r>
+              <w:t xml:space="preserve"> </w:t>
+            </w:r>
+            <w:r>
+              <w:rPr>
+                <w:b/>
+                <w:bCs/>
+              </w:rPr>
+              <w:t xml:space="preserve">Treasury</w:t>
+            </w:r>
+            <w:r>
+              <w:t xml:space="preserve">, or the</w:t>
+            </w:r>
+            <w:r>
+              <w:t xml:space="preserve"> </w:t>
+            </w:r>
+            <w:r>
+              <w:rPr>
+                <w:b/>
+                <w:bCs/>
+              </w:rPr>
+              <w:t xml:space="preserve">POTRAZ Universal Service Fund</w:t>
+            </w:r>
+          </w:p>
+        </w:tc>
+      </w:tr>
+      <w:tr>
+        <w:tc>
+          <w:tcPr/>
+          <w:p>
+            <w:pPr>
+              <w:pStyle w:val="Compact"/>
+            </w:pPr>
+            <w:r>
+              <w:t xml:space="preserve">8.4</w:t>
+            </w:r>
+          </w:p>
+        </w:tc>
+        <w:tc>
+          <w:tcPr/>
+          <w:p>
+            <w:pPr>
+              <w:pStyle w:val="Compact"/>
+            </w:pPr>
+            <w:r>
+              <w:t xml:space="preserve">Capacity — training officers and transferring know-how</w:t>
+            </w:r>
+          </w:p>
+        </w:tc>
+        <w:tc>
+          <w:tcPr/>
+          <w:p>
+            <w:pPr>
+              <w:pStyle w:val="Compact"/>
+            </w:pPr>
+            <w:r>
+              <w:rPr>
+                <w:b/>
+                <w:bCs/>
+              </w:rPr>
+              <w:t xml:space="preserve">ZEPARI</w:t>
+            </w:r>
+            <w:r>
+              <w:t xml:space="preserve">, with</w:t>
+            </w:r>
+            <w:r>
+              <w:t xml:space="preserve"> </w:t>
+            </w:r>
+            <w:r>
+              <w:rPr>
+                <w:b/>
+                <w:bCs/>
+              </w:rPr>
+              <w:t xml:space="preserve">ACBF</w:t>
+            </w:r>
+            <w:r>
+              <w:t xml:space="preserve"> </w:t>
+            </w:r>
+            <w:r>
+              <w:t xml:space="preserve">(the African Capacity Building Foundation)</w:t>
+            </w:r>
+          </w:p>
+        </w:tc>
+      </w:tr>
+      <w:tr>
+        <w:tc>
+          <w:tcPr/>
+          <w:p>
+            <w:pPr>
+              <w:pStyle w:val="Compact"/>
+            </w:pPr>
+            <w:r>
+              <w:t xml:space="preserve">8.5</w:t>
+            </w:r>
+          </w:p>
+        </w:tc>
+        <w:tc>
+          <w:tcPr/>
+          <w:p>
+            <w:pPr>
+              <w:pStyle w:val="Compact"/>
+            </w:pPr>
+            <w:r>
+              <w:t xml:space="preserve">The pilot study — one institution, one policy question, one run</w:t>
+            </w:r>
+          </w:p>
+        </w:tc>
+        <w:tc>
+          <w:tcPr/>
+          <w:p>
+            <w:pPr>
+              <w:pStyle w:val="Compact"/>
+            </w:pPr>
+            <w:r>
+              <w:t xml:space="preserve">A</w:t>
+            </w:r>
+            <w:r>
+              <w:t xml:space="preserve"> </w:t>
+            </w:r>
+            <w:r>
+              <w:rPr>
+                <w:b/>
+                <w:bCs/>
+              </w:rPr>
+              <w:t xml:space="preserve">development partner ZEPARI already works with</w:t>
+            </w:r>
+            <w:r>
+              <w:t xml:space="preserve"> </w:t>
+            </w:r>
+            <w:r>
+              <w:t xml:space="preserve">— UNDP, the African Development Bank, the World Bank or USAID</w:t>
+            </w:r>
+            <w:r>
+              <w:t xml:space="preserve"> </w:t>
+            </w:r>
+            <w:r>
+              <w:rPr>
+                <w:rStyle w:val="VerbatimChar"/>
+              </w:rPr>
+              <w:t xml:space="preserve">[QUESTION — needs a decision]</w:t>
+            </w:r>
+          </w:p>
+        </w:tc>
+      </w:tr>
+      <w:tr>
+        <w:tc>
+          <w:tcPr/>
+          <w:p>
+            <w:pPr>
+              <w:pStyle w:val="Compact"/>
+            </w:pPr>
+            <w:r>
+              <w:t xml:space="preserve">8.6</w:t>
+            </w:r>
+          </w:p>
+        </w:tc>
+        <w:tc>
+          <w:tcPr/>
+          <w:p>
+            <w:pPr>
+              <w:pStyle w:val="Compact"/>
+            </w:pPr>
+            <w:r>
+              <w:t xml:space="preserve">The first sector pilot — applying the tool to one industry</w:t>
+            </w:r>
+          </w:p>
+        </w:tc>
+        <w:tc>
+          <w:tcPr/>
+          <w:p>
+            <w:pPr>
+              <w:pStyle w:val="Compact"/>
+            </w:pPr>
+            <w:r>
+              <w:t xml:space="preserve">The</w:t>
+            </w:r>
+            <w:r>
+              <w:t xml:space="preserve"> </w:t>
+            </w:r>
+            <w:r>
+              <w:rPr>
+                <w:b/>
+                <w:bCs/>
+              </w:rPr>
+              <w:t xml:space="preserve">Chamber of Mines of Zimbabwe</w:t>
+            </w:r>
+            <w:r>
+              <w:t xml:space="preserve"> </w:t>
+            </w:r>
+            <w:r>
+              <w:t xml:space="preserve">or the</w:t>
+            </w:r>
+            <w:r>
+              <w:t xml:space="preserve"> </w:t>
+            </w:r>
+            <w:r>
+              <w:rPr>
+                <w:b/>
+                <w:bCs/>
+              </w:rPr>
+              <w:t xml:space="preserve">Confederation of Zimbabwe Industries (CZI)</w:t>
+            </w:r>
+          </w:p>
+        </w:tc>
+      </w:tr>
+    </w:tbl>
+    <w:p>
+      <w:pPr>
+        <w:pStyle w:val="BodyText"/>
+      </w:pPr>
+      <w:r>
+        <w:t xml:space="preserve">8.7</w:t>
+      </w:r>
+      <w:r>
+        <w:t xml:space="preserve"> </w:t>
+      </w:r>
+      <w:r>
+        <w:rPr>
+          <w:b/>
+          <w:bCs/>
+        </w:rPr>
+        <w:t xml:space="preserve">The cost table.</w:t>
+      </w:r>
+      <w:r>
+        <w:t xml:space="preserve"> </w:t>
+      </w:r>
+      <w:r>
+        <w:t xml:space="preserve">One-off costs are separated from recurring costs; every figure is an</w:t>
+      </w:r>
+      <w:r>
+        <w:t xml:space="preserve"> </w:t>
+      </w:r>
+      <w:r>
+        <w:rPr>
+          <w:rStyle w:val="VerbatimChar"/>
+        </w:rPr>
+        <w:t xml:space="preserve">[ASSUMPTION — to be confirmed]</w:t>
+      </w:r>
+      <w:r>
+        <w:t xml:space="preserve"> </w:t>
+      </w:r>
+      <w:r>
+        <w:t xml:space="preserve">and none is presented as approved.</w:t>
       </w:r>
     </w:p>
     <w:tbl>
@@ -1422,7 +1954,7 @@
               <w:pStyle w:val="Compact"/>
             </w:pPr>
             <w:r>
-              <w:t xml:space="preserve">8.2</w:t>
+              <w:t xml:space="preserve">8.8</w:t>
             </w:r>
           </w:p>
         </w:tc>
@@ -1479,7 +2011,7 @@
               <w:pStyle w:val="Compact"/>
             </w:pPr>
             <w:r>
-              <w:t xml:space="preserve">8.3</w:t>
+              <w:t xml:space="preserve">8.9</w:t>
             </w:r>
           </w:p>
         </w:tc>
@@ -1536,7 +2068,7 @@
               <w:pStyle w:val="Compact"/>
             </w:pPr>
             <w:r>
-              <w:t xml:space="preserve">8.4</w:t>
+              <w:t xml:space="preserve">8.10</w:t>
             </w:r>
           </w:p>
         </w:tc>
@@ -1593,7 +2125,7 @@
               <w:pStyle w:val="Compact"/>
             </w:pPr>
             <w:r>
-              <w:t xml:space="preserve">8.5</w:t>
+              <w:t xml:space="preserve">8.11</w:t>
             </w:r>
           </w:p>
         </w:tc>
@@ -1650,7 +2182,7 @@
               <w:pStyle w:val="Compact"/>
             </w:pPr>
             <w:r>
-              <w:t xml:space="preserve">8.6</w:t>
+              <w:t xml:space="preserve">8.12</w:t>
             </w:r>
           </w:p>
         </w:tc>
@@ -1707,7 +2239,7 @@
               <w:pStyle w:val="Compact"/>
             </w:pPr>
             <w:r>
-              <w:t xml:space="preserve">8.7</w:t>
+              <w:t xml:space="preserve">8.13</w:t>
             </w:r>
           </w:p>
         </w:tc>
@@ -1764,7 +2296,7 @@
               <w:pStyle w:val="Compact"/>
             </w:pPr>
             <w:r>
-              <w:t xml:space="preserve">8.8</w:t>
+              <w:t xml:space="preserve">8.14</w:t>
             </w:r>
           </w:p>
         </w:tc>
@@ -1950,7 +2482,7 @@
           <w:b/>
           <w:bCs/>
         </w:rPr>
-        <w:t xml:space="preserve">The specific risk of borrowing a national programme’s name.</w:t>
+        <w:t xml:space="preserve">The specific risk of borrowing a national programme’s or an institution’s name.</w:t>
       </w:r>
       <w:r>
         <w:t xml:space="preserve"> </w:t>
@@ -1985,10 +2517,20 @@
         <w:t xml:space="preserve">Digitalize Zimbabwe</w:t>
       </w:r>
       <w:r>
-        <w:t xml:space="preserve"> </w:t>
-      </w:r>
-      <w:r>
-        <w:t xml:space="preserve">or the Ministry. This proposal states that plainly, and obtaining the endorsement is part of the ask.</w:t>
+        <w:t xml:space="preserve">, the Ministry</w:t>
+      </w:r>
+      <w:r>
+        <w:t xml:space="preserve"> </w:t>
+      </w:r>
+      <w:r>
+        <w:rPr>
+          <w:b/>
+          <w:bCs/>
+        </w:rPr>
+        <w:t xml:space="preserve">or ZEPARI</w:t>
+      </w:r>
+      <w:r>
+        <w:t xml:space="preserve">. This proposal states that plainly, and obtaining those endorsements is part of the ask.</w:t>
       </w:r>
     </w:p>
     <w:p>
@@ -2145,7 +2687,7 @@
         <w:t xml:space="preserve"> </w:t>
       </w:r>
       <w:r>
-        <w:t xml:space="preserve">programme; and the public text, targets and contents of the National AI Strategy, the National Cybersecurity Strategy and the Smart Zimbabwe 2030 Strategy (their existence is confirmed; their contents are not).</w:t>
+        <w:t xml:space="preserve">programme; ZEPARI’s own approval route for endorsing a pilot and for entering a research partnership, and which of its development partners would fund the pilot study; and the public text, targets and contents of the National AI Strategy, the National Cybersecurity Strategy and the Smart Zimbabwe 2030 Strategy (their existence is confirmed; their contents are not).</w:t>
       </w:r>
     </w:p>
     <w:p>
@@ -2381,7 +2923,20 @@
         <w:t xml:space="preserve"> </w:t>
       </w:r>
       <w:r>
-        <w:t xml:space="preserve">initiative. The ask therefore includes the programme’s</w:t>
+        <w:t xml:space="preserve">initiative, in partnership with</w:t>
+      </w:r>
+      <w:r>
+        <w:t xml:space="preserve"> </w:t>
+      </w:r>
+      <w:r>
+        <w:rPr>
+          <w:b/>
+          <w:bCs/>
+        </w:rPr>
+        <w:t xml:space="preserve">ZEPARI</w:t>
+      </w:r>
+      <w:r>
+        <w:t xml:space="preserve">. The ask therefore includes the programme’s</w:t>
       </w:r>
       <w:r>
         <w:t xml:space="preserve"> </w:t>
@@ -2397,7 +2952,20 @@
         <w:t xml:space="preserve"> </w:t>
       </w:r>
       <w:r>
-        <w:t xml:space="preserve">alongside the funding and the hosting decision.</w:t>
+        <w:t xml:space="preserve">and ZEPARI’s</w:t>
+      </w:r>
+      <w:r>
+        <w:t xml:space="preserve"> </w:t>
+      </w:r>
+      <w:r>
+        <w:rPr>
+          <w:b/>
+          <w:bCs/>
+        </w:rPr>
+        <w:t xml:space="preserve">endorsement and research partnership</w:t>
+      </w:r>
+      <w:r>
+        <w:t xml:space="preserve">, alongside the funding and the hosting decision.</w:t>
       </w:r>
     </w:p>
     <w:p>
@@ -2409,7 +2977,25 @@
           <w:b/>
           <w:bCs/>
         </w:rPr>
-        <w:t xml:space="preserve">The decision requested of the Honourable Minister, Minister of Information Communication Technology, Postal and Courier Services:</w:t>
+        <w:t xml:space="preserve">The decision requested — addressed to all four addressees:</w:t>
+      </w:r>
+      <w:r>
+        <w:t xml:space="preserve"> </w:t>
+      </w:r>
+      <w:r>
+        <w:t xml:space="preserve">the Honourable Minister of Information Communication Technology, Postal and Courier Services; Dr. Gibson Chigumira, Executive Director of ZEPARI; Dr. Jesimen Chipika, Chairperson of the ZEPARI Board of Trustees and Deputy Governor of the Reserve Bank of Zimbabwe; and the ZEPARI Board of Trustees.</w:t>
+      </w:r>
+    </w:p>
+    <w:p>
+      <w:pPr>
+        <w:pStyle w:val="BodyText"/>
+      </w:pPr>
+      <w:r>
+        <w:rPr>
+          <w:b/>
+          <w:bCs/>
+        </w:rPr>
+        <w:t xml:space="preserve">Of the Ministry:</w:t>
       </w:r>
     </w:p>
     <w:p>
@@ -2417,7 +3003,7 @@
         <w:pStyle w:val="Compact"/>
         <w:numPr>
           <w:ilvl w:val="0"/>
-          <w:numId w:val="1002"/>
+          <w:numId w:val="1003"/>
         </w:numPr>
       </w:pPr>
       <w:r>
@@ -2455,7 +3041,7 @@
         <w:pStyle w:val="Compact"/>
         <w:numPr>
           <w:ilvl w:val="0"/>
-          <w:numId w:val="1002"/>
+          <w:numId w:val="1003"/>
         </w:numPr>
       </w:pPr>
       <w:r>
@@ -2477,7 +3063,7 @@
         <w:pStyle w:val="Compact"/>
         <w:numPr>
           <w:ilvl w:val="0"/>
-          <w:numId w:val="1002"/>
+          <w:numId w:val="1003"/>
         </w:numPr>
       </w:pPr>
       <w:r>
@@ -2499,7 +3085,7 @@
         <w:pStyle w:val="Compact"/>
         <w:numPr>
           <w:ilvl w:val="0"/>
-          <w:numId w:val="1002"/>
+          <w:numId w:val="1003"/>
         </w:numPr>
       </w:pPr>
       <w:r>
@@ -2516,6 +3102,360 @@
         <w:t xml:space="preserve">the first pilot institution and the first policy question to be tested.</w:t>
       </w:r>
     </w:p>
+    <w:p>
+      <w:pPr>
+        <w:pStyle w:val="FirstParagraph"/>
+      </w:pPr>
+      <w:r>
+        <w:rPr>
+          <w:b/>
+          <w:bCs/>
+        </w:rPr>
+        <w:t xml:space="preserve">Of ZEPARI:</w:t>
+      </w:r>
+    </w:p>
+    <w:p>
+      <w:pPr>
+        <w:pStyle w:val="Compact"/>
+        <w:numPr>
+          <w:ilvl w:val="0"/>
+          <w:numId w:val="1004"/>
+        </w:numPr>
+      </w:pPr>
+      <w:r>
+        <w:rPr>
+          <w:b/>
+          <w:bCs/>
+        </w:rPr>
+        <w:t xml:space="preserve">Partner</w:t>
+      </w:r>
+      <w:r>
+        <w:t xml:space="preserve"> </w:t>
+      </w:r>
+      <w:r>
+        <w:t xml:space="preserve">on the evidence base and the methods.</w:t>
+      </w:r>
+    </w:p>
+    <w:p>
+      <w:pPr>
+        <w:pStyle w:val="Compact"/>
+        <w:numPr>
+          <w:ilvl w:val="0"/>
+          <w:numId w:val="1004"/>
+        </w:numPr>
+      </w:pPr>
+      <w:r>
+        <w:rPr>
+          <w:b/>
+          <w:bCs/>
+        </w:rPr>
+        <w:t xml:space="preserve">Endorse</w:t>
+      </w:r>
+      <w:r>
+        <w:t xml:space="preserve"> </w:t>
+      </w:r>
+      <w:r>
+        <w:t xml:space="preserve">the platform as a pilot for ZEPARI’s evidence-based policy work.</w:t>
+      </w:r>
+    </w:p>
+    <w:p>
+      <w:pPr>
+        <w:pStyle w:val="FirstParagraph"/>
+      </w:pPr>
+      <w:r>
+        <w:rPr>
+          <w:b/>
+          <w:bCs/>
+        </w:rPr>
+        <w:t xml:space="preserve">The proposed funding route — four named buckets:</w:t>
+      </w:r>
+    </w:p>
+    <w:tbl>
+      <w:tblPr>
+        <w:tblStyle w:val="Table"/>
+        <w:tblW w:type="pct" w:w="5000"/>
+        <w:tblLayout w:type="fixed"/>
+        <w:tblLook w:firstRow="1" w:lastRow="0" w:firstColumn="0" w:lastColumn="0" w:noHBand="0" w:noVBand="0" w:val="0020"/>
+      </w:tblPr>
+      <w:tblGrid>
+        <w:gridCol w:w="2640"/>
+        <w:gridCol w:w="2640"/>
+        <w:gridCol w:w="2640"/>
+      </w:tblGrid>
+      <w:tr>
+        <w:trPr>
+          <w:tblHeader w:val="on"/>
+        </w:trPr>
+        <w:tc>
+          <w:tcPr/>
+          <w:p>
+            <w:pPr>
+              <w:pStyle w:val="Compact"/>
+            </w:pPr>
+            <w:r>
+              <w:t xml:space="preserve">#</w:t>
+            </w:r>
+          </w:p>
+        </w:tc>
+        <w:tc>
+          <w:tcPr/>
+          <w:p>
+            <w:pPr>
+              <w:pStyle w:val="Compact"/>
+            </w:pPr>
+            <w:r>
+              <w:t xml:space="preserve">What it pays for</w:t>
+            </w:r>
+          </w:p>
+        </w:tc>
+        <w:tc>
+          <w:tcPr/>
+          <w:p>
+            <w:pPr>
+              <w:pStyle w:val="Compact"/>
+            </w:pPr>
+            <w:r>
+              <w:t xml:space="preserve">Proposed route</w:t>
+            </w:r>
+          </w:p>
+        </w:tc>
+      </w:tr>
+      <w:tr>
+        <w:tc>
+          <w:tcPr/>
+          <w:p>
+            <w:pPr>
+              <w:pStyle w:val="Compact"/>
+            </w:pPr>
+            <w:r>
+              <w:t xml:space="preserve">A</w:t>
+            </w:r>
+          </w:p>
+        </w:tc>
+        <w:tc>
+          <w:tcPr/>
+          <w:p>
+            <w:pPr>
+              <w:pStyle w:val="Compact"/>
+            </w:pPr>
+            <w:r>
+              <w:t xml:space="preserve">The build</w:t>
+            </w:r>
+          </w:p>
+        </w:tc>
+        <w:tc>
+          <w:tcPr/>
+          <w:p>
+            <w:pPr>
+              <w:pStyle w:val="Compact"/>
+            </w:pPr>
+            <w:r>
+              <w:t xml:space="preserve">Ministry of ICT through</w:t>
+            </w:r>
+            <w:r>
+              <w:t xml:space="preserve"> </w:t>
+            </w:r>
+            <w:r>
+              <w:rPr>
+                <w:b/>
+                <w:bCs/>
+              </w:rPr>
+              <w:t xml:space="preserve">Treasury</w:t>
+            </w:r>
+            <w:r>
+              <w:t xml:space="preserve">, or the</w:t>
+            </w:r>
+            <w:r>
+              <w:t xml:space="preserve"> </w:t>
+            </w:r>
+            <w:r>
+              <w:rPr>
+                <w:b/>
+                <w:bCs/>
+              </w:rPr>
+              <w:t xml:space="preserve">POTRAZ Universal Service Fund</w:t>
+            </w:r>
+          </w:p>
+        </w:tc>
+      </w:tr>
+      <w:tr>
+        <w:tc>
+          <w:tcPr/>
+          <w:p>
+            <w:pPr>
+              <w:pStyle w:val="Compact"/>
+            </w:pPr>
+            <w:r>
+              <w:t xml:space="preserve">B</w:t>
+            </w:r>
+          </w:p>
+        </w:tc>
+        <w:tc>
+          <w:tcPr/>
+          <w:p>
+            <w:pPr>
+              <w:pStyle w:val="Compact"/>
+            </w:pPr>
+            <w:r>
+              <w:t xml:space="preserve">Capacity</w:t>
+            </w:r>
+          </w:p>
+        </w:tc>
+        <w:tc>
+          <w:tcPr/>
+          <w:p>
+            <w:pPr>
+              <w:pStyle w:val="Compact"/>
+            </w:pPr>
+            <w:r>
+              <w:rPr>
+                <w:b/>
+                <w:bCs/>
+              </w:rPr>
+              <w:t xml:space="preserve">ZEPARI</w:t>
+            </w:r>
+            <w:r>
+              <w:t xml:space="preserve"> </w:t>
+            </w:r>
+            <w:r>
+              <w:t xml:space="preserve">with</w:t>
+            </w:r>
+            <w:r>
+              <w:t xml:space="preserve"> </w:t>
+            </w:r>
+            <w:r>
+              <w:rPr>
+                <w:b/>
+                <w:bCs/>
+              </w:rPr>
+              <w:t xml:space="preserve">ACBF</w:t>
+            </w:r>
+          </w:p>
+        </w:tc>
+      </w:tr>
+      <w:tr>
+        <w:tc>
+          <w:tcPr/>
+          <w:p>
+            <w:pPr>
+              <w:pStyle w:val="Compact"/>
+            </w:pPr>
+            <w:r>
+              <w:t xml:space="preserve">C</w:t>
+            </w:r>
+          </w:p>
+        </w:tc>
+        <w:tc>
+          <w:tcPr/>
+          <w:p>
+            <w:pPr>
+              <w:pStyle w:val="Compact"/>
+            </w:pPr>
+            <w:r>
+              <w:t xml:space="preserve">The pilot study</w:t>
+            </w:r>
+          </w:p>
+        </w:tc>
+        <w:tc>
+          <w:tcPr/>
+          <w:p>
+            <w:pPr>
+              <w:pStyle w:val="Compact"/>
+            </w:pPr>
+            <w:r>
+              <w:t xml:space="preserve">A</w:t>
+            </w:r>
+            <w:r>
+              <w:t xml:space="preserve"> </w:t>
+            </w:r>
+            <w:r>
+              <w:rPr>
+                <w:b/>
+                <w:bCs/>
+              </w:rPr>
+              <w:t xml:space="preserve">ZEPARI development partner</w:t>
+            </w:r>
+            <w:r>
+              <w:t xml:space="preserve"> </w:t>
+            </w:r>
+            <w:r>
+              <w:t xml:space="preserve">(UNDP, AfDB, World Bank or USAID)</w:t>
+            </w:r>
+            <w:r>
+              <w:t xml:space="preserve"> </w:t>
+            </w:r>
+            <w:r>
+              <w:rPr>
+                <w:rStyle w:val="VerbatimChar"/>
+              </w:rPr>
+              <w:t xml:space="preserve">[QUESTION — needs a decision]</w:t>
+            </w:r>
+          </w:p>
+        </w:tc>
+      </w:tr>
+      <w:tr>
+        <w:tc>
+          <w:tcPr/>
+          <w:p>
+            <w:pPr>
+              <w:pStyle w:val="Compact"/>
+            </w:pPr>
+            <w:r>
+              <w:t xml:space="preserve">D</w:t>
+            </w:r>
+          </w:p>
+        </w:tc>
+        <w:tc>
+          <w:tcPr/>
+          <w:p>
+            <w:pPr>
+              <w:pStyle w:val="Compact"/>
+            </w:pPr>
+            <w:r>
+              <w:t xml:space="preserve">The first sector pilot</w:t>
+            </w:r>
+          </w:p>
+        </w:tc>
+        <w:tc>
+          <w:tcPr/>
+          <w:p>
+            <w:pPr>
+              <w:pStyle w:val="Compact"/>
+            </w:pPr>
+            <w:r>
+              <w:t xml:space="preserve">The</w:t>
+            </w:r>
+            <w:r>
+              <w:t xml:space="preserve"> </w:t>
+            </w:r>
+            <w:r>
+              <w:rPr>
+                <w:b/>
+                <w:bCs/>
+              </w:rPr>
+              <w:t xml:space="preserve">Chamber of Mines of Zimbabwe</w:t>
+            </w:r>
+            <w:r>
+              <w:t xml:space="preserve"> </w:t>
+            </w:r>
+            <w:r>
+              <w:t xml:space="preserve">or</w:t>
+            </w:r>
+            <w:r>
+              <w:t xml:space="preserve"> </w:t>
+            </w:r>
+            <w:r>
+              <w:rPr>
+                <w:b/>
+                <w:bCs/>
+              </w:rPr>
+              <w:t xml:space="preserve">CZI</w:t>
+            </w:r>
+          </w:p>
+        </w:tc>
+      </w:tr>
+    </w:tbl>
+    <w:p/>
     <w:tbl>
       <w:tblPr>
         <w:tblStyle w:val="Table"/>
@@ -2597,7 +3537,7 @@
               <w:pStyle w:val="Compact"/>
             </w:pPr>
             <w:r>
-              <w:t xml:space="preserve">Approval in principle and programme endorsement</w:t>
+              <w:t xml:space="preserve">Approval in principle, programme endorsement, and ZEPARI’s endorsement and partnership</w:t>
             </w:r>
           </w:p>
         </w:tc>
@@ -2841,7 +3781,7 @@
         <w:t xml:space="preserve"> </w:t>
       </w:r>
       <w:r>
-        <w:t xml:space="preserve">The Ministry’s budget envelope and cost-sharing, the approval deadline, the number of institutions to prioritise first, the exact approval route and format, and the owning office of the Digitalize Zimbabwe programme.</w:t>
+        <w:t xml:space="preserve">The Ministry’s budget envelope and cost-sharing, the approval deadline, the number of institutions to prioritise first, the exact approval route and format, the owning office of the Digitalize Zimbabwe programme, and ZEPARI’s own approval route for endorsing a pilot and the development partner that would fund the pilot study.</w:t>
       </w:r>
       <w:r>
         <w:t xml:space="preserve"> </w:t>
@@ -2857,7 +3797,7 @@
         <w:t xml:space="preserve"> </w:t>
       </w:r>
       <w:r>
-        <w:t xml:space="preserve">the Cabinet Office and the Ministry’s legal desk; the Ministry of ICT, Postal and Courier Services; and Treasury.</w:t>
+        <w:t xml:space="preserve">the Cabinet Office and the Ministry’s legal desk; the Ministry of ICT, Postal and Courier Services; ZEPARI; and Treasury.</w:t>
       </w:r>
     </w:p>
     <w:p>
@@ -2990,6 +3930,109 @@
       </w:pPr>
     </w:lvl>
   </w:abstractNum>
+  <w:abstractNum w:abstractNumId="991">
+    <w:nsid w:val="0000A991"/>
+    <w:multiLevelType w:val="multilevel"/>
+    <w:lvl w:ilvl="0">
+      <w:numFmt w:val="bullet"/>
+      <w:lvlText w:val=""/>
+      <w:lvlJc w:val="left"/>
+      <w:pPr>
+        <w:ind w:left="720" w:hanging="360"/>
+      </w:pPr>
+      <w:rPr>
+        <w:rFonts w:ascii="Symbol" w:hAnsi="Symbol" w:cs="Symbol" w:hint="default"/>
+      </w:rPr>
+    </w:lvl>
+    <w:lvl w:ilvl="1">
+      <w:numFmt w:val="bullet"/>
+      <w:lvlText w:val="o"/>
+      <w:lvlJc w:val="left"/>
+      <w:pPr>
+        <w:ind w:left="1440" w:hanging="360"/>
+      </w:pPr>
+      <w:rPr>
+        <w:rFonts w:ascii="Courier New" w:hAnsi="Courier New" w:cs="Courier New" w:hint="default"/>
+      </w:rPr>
+    </w:lvl>
+    <w:lvl w:ilvl="2">
+      <w:numFmt w:val="bullet"/>
+      <w:lvlText w:val=""/>
+      <w:lvlJc w:val="left"/>
+      <w:pPr>
+        <w:ind w:left="2160" w:hanging="360"/>
+      </w:pPr>
+      <w:rPr>
+        <w:rFonts w:ascii="Wingdings" w:hAnsi="Wingdings" w:cs="Wingdings" w:hint="default"/>
+      </w:rPr>
+    </w:lvl>
+    <w:lvl w:ilvl="3">
+      <w:numFmt w:val="bullet"/>
+      <w:lvlText w:val=""/>
+      <w:lvlJc w:val="left"/>
+      <w:pPr>
+        <w:ind w:left="2880" w:hanging="360"/>
+      </w:pPr>
+      <w:rPr>
+        <w:rFonts w:ascii="Symbol" w:hAnsi="Symbol" w:cs="Symbol" w:hint="default"/>
+      </w:rPr>
+    </w:lvl>
+    <w:lvl w:ilvl="4">
+      <w:numFmt w:val="bullet"/>
+      <w:lvlText w:val="o"/>
+      <w:lvlJc w:val="left"/>
+      <w:pPr>
+        <w:ind w:left="3600" w:hanging="360"/>
+      </w:pPr>
+      <w:rPr>
+        <w:rFonts w:ascii="Courier New" w:hAnsi="Courier New" w:cs="Courier New" w:hint="default"/>
+      </w:rPr>
+    </w:lvl>
+    <w:lvl w:ilvl="5">
+      <w:numFmt w:val="bullet"/>
+      <w:lvlText w:val=""/>
+      <w:lvlJc w:val="left"/>
+      <w:pPr>
+        <w:ind w:left="4320" w:hanging="360"/>
+      </w:pPr>
+      <w:rPr>
+        <w:rFonts w:ascii="Wingdings" w:hAnsi="Wingdings" w:cs="Wingdings" w:hint="default"/>
+      </w:rPr>
+    </w:lvl>
+    <w:lvl w:ilvl="6">
+      <w:numFmt w:val="bullet"/>
+      <w:lvlText w:val=""/>
+      <w:lvlJc w:val="left"/>
+      <w:pPr>
+        <w:ind w:left="5040" w:hanging="360"/>
+      </w:pPr>
+      <w:rPr>
+        <w:rFonts w:ascii="Symbol" w:hAnsi="Symbol" w:cs="Symbol" w:hint="default"/>
+      </w:rPr>
+    </w:lvl>
+    <w:lvl w:ilvl="7">
+      <w:numFmt w:val="bullet"/>
+      <w:lvlText w:val="o"/>
+      <w:lvlJc w:val="left"/>
+      <w:pPr>
+        <w:ind w:left="5760" w:hanging="360"/>
+      </w:pPr>
+      <w:rPr>
+        <w:rFonts w:ascii="Courier New" w:hAnsi="Courier New" w:cs="Courier New" w:hint="default"/>
+      </w:rPr>
+    </w:lvl>
+    <w:lvl w:ilvl="8">
+      <w:numFmt w:val="bullet"/>
+      <w:lvlText w:val=""/>
+      <w:lvlJc w:val="left"/>
+      <w:pPr>
+        <w:ind w:left="6480" w:hanging="360"/>
+      </w:pPr>
+      <w:rPr>
+        <w:rFonts w:ascii="Wingdings" w:hAnsi="Wingdings" w:cs="Wingdings" w:hint="default"/>
+      </w:rPr>
+    </w:lvl>
+  </w:abstractNum>
   <w:abstractNum w:abstractNumId="99411">
     <w:nsid w:val="00A99411"/>
     <w:multiLevelType w:val="multilevel"/>
@@ -3075,10 +4118,98 @@
       </w:pPr>
     </w:lvl>
   </w:abstractNum>
+  <w:abstractNum w:abstractNumId="99415">
+    <w:nsid w:val="00A99415"/>
+    <w:multiLevelType w:val="multilevel"/>
+    <w:lvl w:ilvl="0">
+      <w:start w:val="5"/>
+      <w:numFmt w:val="decimal"/>
+      <w:lvlText w:val="%1."/>
+      <w:lvlJc w:val="left"/>
+      <w:pPr>
+        <w:ind w:left="720" w:hanging="360"/>
+      </w:pPr>
+    </w:lvl>
+    <w:lvl w:ilvl="1">
+      <w:start w:val="5"/>
+      <w:numFmt w:val="decimal"/>
+      <w:lvlText w:val="%2."/>
+      <w:lvlJc w:val="left"/>
+      <w:pPr>
+        <w:ind w:left="1440" w:hanging="360"/>
+      </w:pPr>
+    </w:lvl>
+    <w:lvl w:ilvl="2">
+      <w:start w:val="5"/>
+      <w:numFmt w:val="decimal"/>
+      <w:lvlText w:val="%3."/>
+      <w:lvlJc w:val="left"/>
+      <w:pPr>
+        <w:ind w:left="2160" w:hanging="360"/>
+      </w:pPr>
+    </w:lvl>
+    <w:lvl w:ilvl="3">
+      <w:start w:val="5"/>
+      <w:numFmt w:val="decimal"/>
+      <w:lvlText w:val="%4."/>
+      <w:lvlJc w:val="left"/>
+      <w:pPr>
+        <w:ind w:left="2880" w:hanging="360"/>
+      </w:pPr>
+    </w:lvl>
+    <w:lvl w:ilvl="4">
+      <w:start w:val="5"/>
+      <w:numFmt w:val="decimal"/>
+      <w:lvlText w:val="%5."/>
+      <w:lvlJc w:val="left"/>
+      <w:pPr>
+        <w:ind w:left="3600" w:hanging="360"/>
+      </w:pPr>
+    </w:lvl>
+    <w:lvl w:ilvl="5">
+      <w:start w:val="5"/>
+      <w:numFmt w:val="decimal"/>
+      <w:lvlText w:val="%6."/>
+      <w:lvlJc w:val="left"/>
+      <w:pPr>
+        <w:ind w:left="4320" w:hanging="360"/>
+      </w:pPr>
+    </w:lvl>
+    <w:lvl w:ilvl="6">
+      <w:start w:val="5"/>
+      <w:numFmt w:val="decimal"/>
+      <w:lvlText w:val="%7."/>
+      <w:lvlJc w:val="left"/>
+      <w:pPr>
+        <w:ind w:left="5040" w:hanging="360"/>
+      </w:pPr>
+    </w:lvl>
+    <w:lvl w:ilvl="7">
+      <w:start w:val="5"/>
+      <w:numFmt w:val="decimal"/>
+      <w:lvlText w:val="%8."/>
+      <w:lvlJc w:val="left"/>
+      <w:pPr>
+        <w:ind w:left="5760" w:hanging="360"/>
+      </w:pPr>
+    </w:lvl>
+    <w:lvl w:ilvl="8">
+      <w:start w:val="5"/>
+      <w:numFmt w:val="decimal"/>
+      <w:lvlText w:val="%9."/>
+      <w:lvlJc w:val="left"/>
+      <w:pPr>
+        <w:ind w:left="6480" w:hanging="360"/>
+      </w:pPr>
+    </w:lvl>
+  </w:abstractNum>
   <w:num w:numId="1000">
     <w:abstractNumId w:val="990"/>
   </w:num>
   <w:num w:numId="1001">
+    <w:abstractNumId w:val="991"/>
+  </w:num>
+  <w:num w:numId="1002">
     <w:abstractNumId w:val="99411"/>
     <w:lvlOverride w:ilvl="0">
       <w:startOverride w:val="1"/>
@@ -3108,7 +4239,7 @@
       <w:startOverride w:val="1"/>
     </w:lvlOverride>
   </w:num>
-  <w:num w:numId="1002">
+  <w:num w:numId="1003">
     <w:abstractNumId w:val="99411"/>
     <w:lvlOverride w:ilvl="0">
       <w:startOverride w:val="1"/>
@@ -3136,6 +4267,36 @@
     </w:lvlOverride>
     <w:lvlOverride w:ilvl="8">
       <w:startOverride w:val="1"/>
+    </w:lvlOverride>
+  </w:num>
+  <w:num w:numId="1004">
+    <w:abstractNumId w:val="99415"/>
+    <w:lvlOverride w:ilvl="0">
+      <w:startOverride w:val="5"/>
+    </w:lvlOverride>
+    <w:lvlOverride w:ilvl="1">
+      <w:startOverride w:val="5"/>
+    </w:lvlOverride>
+    <w:lvlOverride w:ilvl="2">
+      <w:startOverride w:val="5"/>
+    </w:lvlOverride>
+    <w:lvlOverride w:ilvl="3">
+      <w:startOverride w:val="5"/>
+    </w:lvlOverride>
+    <w:lvlOverride w:ilvl="4">
+      <w:startOverride w:val="5"/>
+    </w:lvlOverride>
+    <w:lvlOverride w:ilvl="5">
+      <w:startOverride w:val="5"/>
+    </w:lvlOverride>
+    <w:lvlOverride w:ilvl="6">
+      <w:startOverride w:val="5"/>
+    </w:lvlOverride>
+    <w:lvlOverride w:ilvl="7">
+      <w:startOverride w:val="5"/>
+    </w:lvlOverride>
+    <w:lvlOverride w:ilvl="8">
+      <w:startOverride w:val="5"/>
     </w:lvlOverride>
   </w:num>
 </w:numbering>

</xml_diff>

<commit_message>
docs: the one-page Executive Justification Summary, and two Word defects fixed at source
Built Nzwisisos Executive Justification Summary (plan item 18) — measured at one printed page, with every figure read from the proposal and the Service Agreement so the three cannot disagree.

Two real defects in the Word files the Ministry receives, both fixed at source: the price-comparison paragraph had its dollar signs eaten as arithmetic (US$20 million read as US20million**andsignedat**US10 million), and the proposal numbered two clauses 4.9 and two 4.10.

New gate: scripts/build-minister-docx.py builds every Minister-facing Word file from its markdown and refuses on an unescaped dollar, a repeated clause number, a Word file that no longer matches its markdown, or a Summary that is not one page. Wired into npm run validate as check 54, and proved able to fail four ways.
</commit_message>
<xml_diff>
--- a/Minister Submission/Oreida_Proposal_Minister_of_ICT.docx
+++ b/Minister Submission/Oreida_Proposal_Minister_of_ICT.docx
@@ -1087,7 +1087,7 @@
         <w:pStyle w:val="BodyText"/>
       </w:pPr>
       <w:r>
-        <w:t xml:space="preserve">4.9</w:t>
+        <w:t xml:space="preserve">4.11</w:t>
       </w:r>
       <w:r>
         <w:t xml:space="preserve"> </w:t>
@@ -1153,7 +1153,7 @@
         <w:pStyle w:val="BodyText"/>
       </w:pPr>
       <w:r>
-        <w:t xml:space="preserve">4.10</w:t>
+        <w:t xml:space="preserve">4.12</w:t>
       </w:r>
       <w:r>
         <w:t xml:space="preserve"> </w:t>
@@ -3113,103 +3113,23 @@
           <w:b/>
           <w:bCs/>
         </w:rPr>
-        <w:t xml:space="preserve">US</w:t>
-      </w:r>
-      <m:oMath>
-        <m:r>
-          <m:t>20</m:t>
-        </m:r>
-        <m:r>
-          <m:t>m</m:t>
-        </m:r>
-        <m:r>
-          <m:t>i</m:t>
-        </m:r>
-        <m:r>
-          <m:t>l</m:t>
-        </m:r>
-        <m:r>
-          <m:t>l</m:t>
-        </m:r>
-        <m:r>
-          <m:t>i</m:t>
-        </m:r>
-        <m:r>
-          <m:t>o</m:t>
-        </m:r>
-        <m:r>
-          <m:t>n</m:t>
-        </m:r>
-        <m:r>
-          <m:rPr>
-            <m:sty m:val="p"/>
-          </m:rPr>
-          <m:t>*</m:t>
-        </m:r>
-        <m:r>
-          <m:rPr>
-            <m:sty m:val="p"/>
-          </m:rPr>
-          <m:t>*</m:t>
-        </m:r>
-        <m:r>
-          <m:t>a</m:t>
-        </m:r>
-        <m:r>
-          <m:t>n</m:t>
-        </m:r>
-        <m:r>
-          <m:t>d</m:t>
-        </m:r>
-        <m:r>
-          <m:t>s</m:t>
-        </m:r>
-        <m:r>
-          <m:t>i</m:t>
-        </m:r>
-        <m:r>
-          <m:t>g</m:t>
-        </m:r>
-        <m:r>
-          <m:t>n</m:t>
-        </m:r>
-        <m:r>
-          <m:t>e</m:t>
-        </m:r>
-        <m:r>
-          <m:t>d</m:t>
-        </m:r>
-        <m:r>
-          <m:t>a</m:t>
-        </m:r>
-        <m:r>
-          <m:t>t</m:t>
-        </m:r>
-        <m:r>
-          <m:rPr>
-            <m:sty m:val="p"/>
-          </m:rPr>
-          <m:t>*</m:t>
-        </m:r>
-        <m:r>
-          <m:rPr>
-            <m:sty m:val="p"/>
-          </m:rPr>
-          <m:t>*</m:t>
-        </m:r>
-        <m:r>
-          <m:t>U</m:t>
-        </m:r>
-        <m:r>
-          <m:t>S</m:t>
-        </m:r>
-      </m:oMath>
-      <w:r>
-        <w:rPr>
-          <w:b/>
-          <w:bCs/>
-        </w:rPr>
-        <w:t xml:space="preserve">10 million</w:t>
+        <w:t xml:space="preserve">US$20 million</w:t>
+      </w:r>
+      <w:r>
+        <w:t xml:space="preserve"> </w:t>
+      </w:r>
+      <w:r>
+        <w:t xml:space="preserve">and signed at</w:t>
+      </w:r>
+      <w:r>
+        <w:t xml:space="preserve"> </w:t>
+      </w:r>
+      <w:r>
+        <w:rPr>
+          <w:b/>
+          <w:bCs/>
+        </w:rPr>
+        <w:t xml:space="preserve">US$10 million</w:t>
       </w:r>
       <w:r>
         <w:t xml:space="preserve">, and the Government pays</w:t>
@@ -3222,811 +3142,52 @@
           <w:b/>
           <w:bCs/>
         </w:rPr>
-        <w:t xml:space="preserve">approximately US</w:t>
-      </w:r>
-      <m:oMath>
-        <m:r>
-          <m:t>3</m:t>
-        </m:r>
-        <m:r>
-          <m:t>m</m:t>
-        </m:r>
-        <m:r>
-          <m:t>i</m:t>
-        </m:r>
-        <m:r>
-          <m:t>l</m:t>
-        </m:r>
-        <m:r>
-          <m:t>l</m:t>
-        </m:r>
-        <m:r>
-          <m:t>i</m:t>
-        </m:r>
-        <m:r>
-          <m:t>o</m:t>
-        </m:r>
-        <m:r>
-          <m:t>n</m:t>
-        </m:r>
-        <m:r>
-          <m:t>a</m:t>
-        </m:r>
-        <m:r>
-          <m:t>y</m:t>
-        </m:r>
-        <m:r>
-          <m:t>e</m:t>
-        </m:r>
-        <m:r>
-          <m:t>a</m:t>
-        </m:r>
-        <m:r>
-          <m:t>r</m:t>
-        </m:r>
-        <m:r>
-          <m:rPr>
-            <m:sty m:val="p"/>
-          </m:rPr>
-          <m:t>*</m:t>
-        </m:r>
-        <m:r>
-          <m:rPr>
-            <m:sty m:val="p"/>
-          </m:rPr>
-          <m:t>*</m:t>
-        </m:r>
-        <m:r>
-          <m:t>t</m:t>
-        </m:r>
-        <m:r>
-          <m:t>o</m:t>
-        </m:r>
-        <m:r>
-          <m:t>m</m:t>
-        </m:r>
-        <m:r>
-          <m:t>a</m:t>
-        </m:r>
-        <m:r>
-          <m:t>i</m:t>
-        </m:r>
-        <m:r>
-          <m:t>n</m:t>
-        </m:r>
-        <m:r>
-          <m:t>t</m:t>
-        </m:r>
-        <m:r>
-          <m:t>a</m:t>
-        </m:r>
-        <m:r>
-          <m:t>i</m:t>
-        </m:r>
-        <m:r>
-          <m:t>n</m:t>
-        </m:r>
-        <m:r>
-          <m:t>t</m:t>
-        </m:r>
-        <m:r>
-          <m:t>h</m:t>
-        </m:r>
-        <m:r>
-          <m:t>a</m:t>
-        </m:r>
-        <m:r>
-          <m:t>t</m:t>
-        </m:r>
-        <m:r>
-          <m:t>s</m:t>
-        </m:r>
-        <m:r>
-          <m:t>y</m:t>
-        </m:r>
-        <m:r>
-          <m:t>s</m:t>
-        </m:r>
-        <m:r>
-          <m:t>t</m:t>
-        </m:r>
-        <m:r>
-          <m:t>e</m:t>
-        </m:r>
-        <m:r>
-          <m:t>m</m:t>
-        </m:r>
-        <m:r>
-          <m:t>a</m:t>
-        </m:r>
-        <m:r>
-          <m:t>l</m:t>
-        </m:r>
-        <m:r>
-          <m:t>o</m:t>
-        </m:r>
-        <m:r>
-          <m:t>n</m:t>
-        </m:r>
-        <m:r>
-          <m:t>e</m:t>
-        </m:r>
-        <m:r>
-          <m:rPr>
-            <m:sty m:val="p"/>
-          </m:rPr>
-          <m:t>*</m:t>
-        </m:r>
-        <m:r>
-          <m:rPr>
-            <m:sty m:val="p"/>
-          </m:rPr>
-          <m:t>(</m:t>
-        </m:r>
-        <m:r>
-          <m:t>W</m:t>
-        </m:r>
-        <m:r>
-          <m:t>o</m:t>
-        </m:r>
-        <m:r>
-          <m:t>r</m:t>
-        </m:r>
-        <m:r>
-          <m:t>l</m:t>
-        </m:r>
-        <m:r>
-          <m:t>d</m:t>
-        </m:r>
-        <m:r>
-          <m:t>B</m:t>
-        </m:r>
-        <m:r>
-          <m:t>a</m:t>
-        </m:r>
-        <m:r>
-          <m:t>n</m:t>
-        </m:r>
-        <m:r>
-          <m:t>k</m:t>
-        </m:r>
-        <m:r>
-          <m:rPr>
-            <m:sty m:val="p"/>
-          </m:rPr>
-          <m:t>,</m:t>
-        </m:r>
-        <m:r>
-          <m:t>Z</m:t>
-        </m:r>
-        <m:r>
-          <m:t>i</m:t>
-        </m:r>
-        <m:r>
-          <m:t>m</m:t>
-        </m:r>
-        <m:r>
-          <m:t>b</m:t>
-        </m:r>
-        <m:r>
-          <m:t>a</m:t>
-        </m:r>
-        <m:r>
-          <m:t>b</m:t>
-        </m:r>
-        <m:r>
-          <m:t>w</m:t>
-        </m:r>
-        <m:r>
-          <m:t>e</m:t>
-        </m:r>
-        <m:r>
-          <m:rPr>
-            <m:sty m:val="p"/>
-          </m:rPr>
-          <m:t>:</m:t>
-        </m:r>
-        <m:r>
-          <m:t>P</m:t>
-        </m:r>
-        <m:r>
-          <m:t>u</m:t>
-        </m:r>
-        <m:r>
-          <m:t>b</m:t>
-        </m:r>
-        <m:r>
-          <m:t>l</m:t>
-        </m:r>
-        <m:r>
-          <m:t>i</m:t>
-        </m:r>
-        <m:r>
-          <m:t>c</m:t>
-        </m:r>
-        <m:r>
-          <m:t>F</m:t>
-        </m:r>
-        <m:r>
-          <m:t>i</m:t>
-        </m:r>
-        <m:r>
-          <m:t>n</m:t>
-        </m:r>
-        <m:r>
-          <m:t>a</m:t>
-        </m:r>
-        <m:r>
-          <m:t>n</m:t>
-        </m:r>
-        <m:r>
-          <m:t>c</m:t>
-        </m:r>
-        <m:r>
-          <m:t>i</m:t>
-        </m:r>
-        <m:r>
-          <m:t>a</m:t>
-        </m:r>
-        <m:r>
-          <m:t>l</m:t>
-        </m:r>
-        <m:r>
-          <m:t>M</m:t>
-        </m:r>
-        <m:r>
-          <m:t>a</m:t>
-        </m:r>
-        <m:r>
-          <m:t>n</m:t>
-        </m:r>
-        <m:r>
-          <m:t>a</m:t>
-        </m:r>
-        <m:r>
-          <m:t>g</m:t>
-        </m:r>
-        <m:r>
-          <m:t>e</m:t>
-        </m:r>
-        <m:r>
-          <m:t>m</m:t>
-        </m:r>
-        <m:r>
-          <m:t>e</m:t>
-        </m:r>
-        <m:r>
-          <m:t>n</m:t>
-        </m:r>
-        <m:r>
-          <m:t>t</m:t>
-        </m:r>
-        <m:r>
-          <m:t>E</m:t>
-        </m:r>
-        <m:r>
-          <m:t>n</m:t>
-        </m:r>
-        <m:r>
-          <m:t>h</m:t>
-        </m:r>
-        <m:r>
-          <m:t>a</m:t>
-        </m:r>
-        <m:r>
-          <m:t>n</m:t>
-        </m:r>
-        <m:r>
-          <m:t>c</m:t>
-        </m:r>
-        <m:r>
-          <m:t>e</m:t>
-        </m:r>
-        <m:r>
-          <m:t>m</m:t>
-        </m:r>
-        <m:r>
-          <m:t>e</m:t>
-        </m:r>
-        <m:r>
-          <m:t>n</m:t>
-        </m:r>
-        <m:r>
-          <m:t>t</m:t>
-        </m:r>
-        <m:r>
-          <m:t>P</m:t>
-        </m:r>
-        <m:r>
-          <m:t>r</m:t>
-        </m:r>
-        <m:r>
-          <m:t>o</m:t>
-        </m:r>
-        <m:r>
-          <m:t>j</m:t>
-        </m:r>
-        <m:r>
-          <m:t>e</m:t>
-        </m:r>
-        <m:r>
-          <m:t>c</m:t>
-        </m:r>
-        <m:r>
-          <m:t>t</m:t>
-        </m:r>
-        <m:r>
-          <m:rPr>
-            <m:sty m:val="p"/>
-          </m:rPr>
-          <m:t>,</m:t>
-        </m:r>
-        <m:r>
-          <m:t>r</m:t>
-        </m:r>
-        <m:r>
-          <m:t>e</m:t>
-        </m:r>
-        <m:r>
-          <m:t>p</m:t>
-        </m:r>
-        <m:r>
-          <m:t>o</m:t>
-        </m:r>
-        <m:r>
-          <m:t>r</m:t>
-        </m:r>
-        <m:r>
-          <m:t>t</m:t>
-        </m:r>
-        <m:r>
-          <m:t>I</m:t>
-        </m:r>
-        <m:r>
-          <m:t>C</m:t>
-        </m:r>
-        <m:r>
-          <m:t>R</m:t>
-        </m:r>
-        <m:r>
-          <m:t>00005623</m:t>
-        </m:r>
-        <m:r>
-          <m:rPr>
-            <m:sty m:val="p"/>
-          </m:rPr>
-          <m:t>,</m:t>
-        </m:r>
-        <m:r>
-          <m:t>4</m:t>
-        </m:r>
-        <m:r>
-          <m:t>F</m:t>
-        </m:r>
-        <m:r>
-          <m:t>e</m:t>
-        </m:r>
-        <m:r>
-          <m:t>b</m:t>
-        </m:r>
-        <m:r>
-          <m:t>r</m:t>
-        </m:r>
-        <m:r>
-          <m:t>u</m:t>
-        </m:r>
-        <m:r>
-          <m:t>a</m:t>
-        </m:r>
-        <m:r>
-          <m:t>r</m:t>
-        </m:r>
-        <m:r>
-          <m:t>y</m:t>
-        </m:r>
-        <m:r>
-          <m:t>2022</m:t>
-        </m:r>
-        <m:r>
-          <m:rPr>
-            <m:sty m:val="p"/>
-          </m:rPr>
-          <m:t>)</m:t>
-        </m:r>
-        <m:r>
-          <m:rPr>
-            <m:sty m:val="p"/>
-          </m:rPr>
-          <m:t>*</m:t>
-        </m:r>
-        <m:r>
-          <m:rPr>
-            <m:sty m:val="p"/>
-          </m:rPr>
-          <m:t>.</m:t>
-        </m:r>
-        <m:r>
-          <m:t>C</m:t>
-        </m:r>
-        <m:r>
-          <m:t>o</m:t>
-        </m:r>
-        <m:r>
-          <m:t>m</m:t>
-        </m:r>
-        <m:r>
-          <m:t>p</m:t>
-        </m:r>
-        <m:r>
-          <m:t>a</m:t>
-        </m:r>
-        <m:r>
-          <m:t>r</m:t>
-        </m:r>
-        <m:r>
-          <m:t>a</m:t>
-        </m:r>
-        <m:r>
-          <m:t>b</m:t>
-        </m:r>
-        <m:r>
-          <m:t>l</m:t>
-        </m:r>
-        <m:r>
-          <m:t>e</m:t>
-        </m:r>
-        <m:r>
-          <m:t>n</m:t>
-        </m:r>
-        <m:r>
-          <m:t>a</m:t>
-        </m:r>
-        <m:r>
-          <m:t>t</m:t>
-        </m:r>
-        <m:r>
-          <m:t>i</m:t>
-        </m:r>
-        <m:r>
-          <m:t>o</m:t>
-        </m:r>
-        <m:r>
-          <m:t>n</m:t>
-        </m:r>
-        <m:r>
-          <m:t>a</m:t>
-        </m:r>
-        <m:r>
-          <m:t>l</m:t>
-        </m:r>
-        <m:r>
-          <m:t>p</m:t>
-        </m:r>
-        <m:r>
-          <m:t>l</m:t>
-        </m:r>
-        <m:r>
-          <m:t>a</m:t>
-        </m:r>
-        <m:r>
-          <m:t>t</m:t>
-        </m:r>
-        <m:r>
-          <m:t>f</m:t>
-        </m:r>
-        <m:r>
-          <m:t>o</m:t>
-        </m:r>
-        <m:r>
-          <m:t>r</m:t>
-        </m:r>
-        <m:r>
-          <m:t>m</m:t>
-        </m:r>
-        <m:r>
-          <m:t>s</m:t>
-        </m:r>
-        <m:r>
-          <m:t>b</m:t>
-        </m:r>
-        <m:r>
-          <m:t>u</m:t>
-        </m:r>
-        <m:r>
-          <m:t>i</m:t>
-        </m:r>
-        <m:r>
-          <m:t>l</m:t>
-        </m:r>
-        <m:r>
-          <m:t>t</m:t>
-        </m:r>
-        <m:r>
-          <m:t>b</m:t>
-        </m:r>
-        <m:r>
-          <m:t>y</m:t>
-        </m:r>
-        <m:r>
-          <m:t>o</m:t>
-        </m:r>
-        <m:r>
-          <m:t>t</m:t>
-        </m:r>
-        <m:r>
-          <m:t>h</m:t>
-        </m:r>
-        <m:r>
-          <m:t>e</m:t>
-        </m:r>
-        <m:r>
-          <m:t>r</m:t>
-        </m:r>
-        <m:r>
-          <m:t>A</m:t>
-        </m:r>
-        <m:r>
-          <m:t>f</m:t>
-        </m:r>
-        <m:r>
-          <m:t>r</m:t>
-        </m:r>
-        <m:r>
-          <m:t>i</m:t>
-        </m:r>
-        <m:r>
-          <m:t>c</m:t>
-        </m:r>
-        <m:r>
-          <m:t>a</m:t>
-        </m:r>
-        <m:r>
-          <m:t>n</m:t>
-        </m:r>
-        <m:r>
-          <m:t>g</m:t>
-        </m:r>
-        <m:r>
-          <m:t>o</m:t>
-        </m:r>
-        <m:r>
-          <m:t>v</m:t>
-        </m:r>
-        <m:r>
-          <m:t>e</m:t>
-        </m:r>
-        <m:r>
-          <m:t>r</m:t>
-        </m:r>
-        <m:r>
-          <m:t>n</m:t>
-        </m:r>
-        <m:r>
-          <m:t>m</m:t>
-        </m:r>
-        <m:r>
-          <m:t>e</m:t>
-        </m:r>
-        <m:r>
-          <m:t>n</m:t>
-        </m:r>
-        <m:r>
-          <m:t>t</m:t>
-        </m:r>
-        <m:r>
-          <m:t>s</m:t>
-        </m:r>
-        <m:r>
-          <m:t>c</m:t>
-        </m:r>
-        <m:r>
-          <m:t>o</m:t>
-        </m:r>
-        <m:r>
-          <m:t>s</m:t>
-        </m:r>
-        <m:r>
-          <m:t>t</m:t>
-        </m:r>
-        <m:r>
-          <m:rPr>
-            <m:sty m:val="p"/>
-          </m:rPr>
-          <m:t>*</m:t>
-        </m:r>
-        <m:r>
-          <m:rPr>
-            <m:sty m:val="p"/>
-          </m:rPr>
-          <m:t>*</m:t>
-        </m:r>
-        <m:r>
-          <m:t>U</m:t>
-        </m:r>
-        <m:r>
-          <m:t>S</m:t>
-        </m:r>
-      </m:oMath>
-      <w:r>
-        <w:rPr>
-          <w:b/>
-          <w:bCs/>
-        </w:rPr>
-        <w:t xml:space="preserve">1.45 million to US</w:t>
-      </w:r>
-      <m:oMath>
-        <m:r>
-          <m:t>7.8</m:t>
-        </m:r>
-        <m:r>
-          <m:t>m</m:t>
-        </m:r>
-        <m:r>
-          <m:t>i</m:t>
-        </m:r>
-        <m:r>
-          <m:t>l</m:t>
-        </m:r>
-        <m:r>
-          <m:t>l</m:t>
-        </m:r>
-        <m:r>
-          <m:t>i</m:t>
-        </m:r>
-        <m:r>
-          <m:t>o</m:t>
-        </m:r>
-        <m:r>
-          <m:t>n</m:t>
-        </m:r>
-        <m:r>
-          <m:rPr>
-            <m:sty m:val="p"/>
-          </m:rPr>
-          <m:t>*</m:t>
-        </m:r>
-        <m:r>
-          <m:rPr>
-            <m:sty m:val="p"/>
-          </m:rPr>
-          <m:t>*</m:t>
-        </m:r>
-        <m:r>
-          <m:t>t</m:t>
-        </m:r>
-        <m:r>
-          <m:t>o</m:t>
-        </m:r>
-        <m:r>
-          <m:t>d</m:t>
-        </m:r>
-        <m:r>
-          <m:t>e</m:t>
-        </m:r>
-        <m:r>
-          <m:t>s</m:t>
-        </m:r>
-        <m:r>
-          <m:t>i</m:t>
-        </m:r>
-        <m:r>
-          <m:t>g</m:t>
-        </m:r>
-        <m:r>
-          <m:t>n</m:t>
-        </m:r>
-        <m:r>
-          <m:t>a</m:t>
-        </m:r>
-        <m:r>
-          <m:t>n</m:t>
-        </m:r>
-        <m:r>
-          <m:t>d</m:t>
-        </m:r>
-        <m:r>
-          <m:t>b</m:t>
-        </m:r>
-        <m:r>
-          <m:t>u</m:t>
-        </m:r>
-        <m:r>
-          <m:t>i</m:t>
-        </m:r>
-        <m:r>
-          <m:t>l</m:t>
-        </m:r>
-        <m:r>
-          <m:t>d</m:t>
-        </m:r>
-        <m:r>
-          <m:rPr>
-            <m:sty m:val="p"/>
-          </m:rPr>
-          <m:t>,</m:t>
-        </m:r>
-        <m:r>
-          <m:t>w</m:t>
-        </m:r>
-        <m:r>
-          <m:t>i</m:t>
-        </m:r>
-        <m:r>
-          <m:t>t</m:t>
-        </m:r>
-        <m:r>
-          <m:t>h</m:t>
-        </m:r>
-        <m:r>
-          <m:t>a</m:t>
-        </m:r>
-        <m:r>
-          <m:t>n</m:t>
-        </m:r>
-        <m:r>
-          <m:t>n</m:t>
-        </m:r>
-        <m:r>
-          <m:t>u</m:t>
-        </m:r>
-        <m:r>
-          <m:t>a</m:t>
-        </m:r>
-        <m:r>
-          <m:t>l</m:t>
-        </m:r>
-        <m:r>
-          <m:t>r</m:t>
-        </m:r>
-        <m:r>
-          <m:t>u</m:t>
-        </m:r>
-        <m:r>
-          <m:t>n</m:t>
-        </m:r>
-        <m:r>
-          <m:t>n</m:t>
-        </m:r>
-        <m:r>
-          <m:t>i</m:t>
-        </m:r>
-        <m:r>
-          <m:t>n</m:t>
-        </m:r>
-        <m:r>
-          <m:t>g</m:t>
-        </m:r>
-        <m:r>
-          <m:t>o</m:t>
-        </m:r>
-        <m:r>
-          <m:t>f</m:t>
-        </m:r>
-        <m:r>
-          <m:rPr>
-            <m:sty m:val="p"/>
-          </m:rPr>
-          <m:t>*</m:t>
-        </m:r>
-        <m:r>
-          <m:rPr>
-            <m:sty m:val="p"/>
-          </m:rPr>
-          <m:t>*</m:t>
-        </m:r>
-        <m:r>
-          <m:t>U</m:t>
-        </m:r>
-        <m:r>
-          <m:t>S</m:t>
-        </m:r>
-      </m:oMath>
-      <w:r>
-        <w:rPr>
-          <w:b/>
-          <w:bCs/>
-        </w:rPr>
-        <w:t xml:space="preserve">155,000 to US$873,000</w:t>
+        <w:t xml:space="preserve">approximately US$3 million a year</w:t>
+      </w:r>
+      <w:r>
+        <w:t xml:space="preserve"> </w:t>
+      </w:r>
+      <w:r>
+        <w:t xml:space="preserve">to maintain that system alone</w:t>
+      </w:r>
+      <w:r>
+        <w:t xml:space="preserve"> </w:t>
+      </w:r>
+      <w:r>
+        <w:rPr>
+          <w:i/>
+          <w:iCs/>
+        </w:rPr>
+        <w:t xml:space="preserve">(World Bank, Zimbabwe: Public Financial Management Enhancement Project, report ICR00005623, 4 February 2022)</w:t>
+      </w:r>
+      <w:r>
+        <w:t xml:space="preserve">. Comparable national platforms built by other African governments cost</w:t>
+      </w:r>
+      <w:r>
+        <w:t xml:space="preserve"> </w:t>
+      </w:r>
+      <w:r>
+        <w:rPr>
+          <w:b/>
+          <w:bCs/>
+        </w:rPr>
+        <w:t xml:space="preserve">US$1.45 million to US$7.8 million</w:t>
+      </w:r>
+      <w:r>
+        <w:t xml:space="preserve"> </w:t>
+      </w:r>
+      <w:r>
+        <w:t xml:space="preserve">to design and build, with annual running of</w:t>
+      </w:r>
+      <w:r>
+        <w:t xml:space="preserve"> </w:t>
+      </w:r>
+      <w:r>
+        <w:rPr>
+          <w:b/>
+          <w:bCs/>
+        </w:rPr>
+        <w:t xml:space="preserve">US$155,000 to US$873,000</w:t>
       </w:r>
       <w:r>
         <w:t xml:space="preserve"> </w:t>

</xml_diff>